<commit_message>
Credenciales tamaño e instrucciones
</commit_message>
<xml_diff>
--- a/public/plantillas/FrenteMatutino.docx
+++ b/public/plantillas/FrenteMatutino.docx
@@ -20,16 +20,16 @@
         <mc:AlternateContent>
           <mc:Choice Requires="wps">
             <w:drawing>
-              <wp:anchor distT="0" distB="0" distL="114300" distR="114300" simplePos="0" relativeHeight="251659264" behindDoc="0" locked="0" layoutInCell="1" allowOverlap="1" wp14:anchorId="76D0EE1A" wp14:editId="484B5C3F">
+              <wp:anchor distT="0" distB="0" distL="114300" distR="114300" simplePos="0" relativeHeight="251659264" behindDoc="0" locked="0" layoutInCell="1" allowOverlap="1" wp14:anchorId="76D0EE1A" wp14:editId="69A30317">
                 <wp:simplePos x="0" y="0"/>
                 <wp:positionH relativeFrom="column">
-                  <wp:posOffset>1395454</wp:posOffset>
+                  <wp:posOffset>1423767</wp:posOffset>
                 </wp:positionH>
                 <wp:positionV relativeFrom="paragraph">
-                  <wp:posOffset>927321</wp:posOffset>
+                  <wp:posOffset>917037</wp:posOffset>
                 </wp:positionV>
-                <wp:extent cx="810895" cy="772414"/>
-                <wp:effectExtent l="0" t="0" r="27305" b="27940"/>
+                <wp:extent cx="764931" cy="706315"/>
+                <wp:effectExtent l="0" t="0" r="16510" b="17780"/>
                 <wp:wrapNone/>
                 <wp:docPr id="111" name="Graphic 5"/>
                 <wp:cNvGraphicFramePr/>
@@ -40,7 +40,7 @@
                       <wps:spPr>
                         <a:xfrm>
                           <a:off x="0" y="0"/>
-                          <a:ext cx="810895" cy="772414"/>
+                          <a:ext cx="764931" cy="706315"/>
                         </a:xfrm>
                         <a:custGeom>
                           <a:avLst/>
@@ -161,7 +161,7 @@
           </mc:Choice>
           <mc:Fallback>
             <w:pict>
-              <v:shape w14:anchorId="76D0EE1A" id="Graphic 5" o:spid="_x0000_s1026" style="position:absolute;left:0;text-align:left;margin-left:109.9pt;margin-top:73pt;width:63.85pt;height:60.8pt;z-index:251659264;visibility:visible;mso-wrap-style:square;mso-width-percent:0;mso-height-percent:0;mso-wrap-distance-left:9pt;mso-wrap-distance-top:0;mso-wrap-distance-right:9pt;mso-wrap-distance-bottom:0;mso-position-horizontal:absolute;mso-position-horizontal-relative:text;mso-position-vertical:absolute;mso-position-vertical-relative:text;mso-width-percent:0;mso-height-percent:0;mso-width-relative:margin;mso-height-relative:margin;v-text-anchor:top" coordsize="900430,1080135" o:spt="100" o:gfxdata="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" adj="-11796480,,5400" path="m,1079995r899998,l899998,,,,,1079995xe" filled="f" strokeweight=".25pt">
+              <v:shape w14:anchorId="76D0EE1A" id="Graphic 5" o:spid="_x0000_s1026" style="position:absolute;left:0;text-align:left;margin-left:112.1pt;margin-top:72.2pt;width:60.25pt;height:55.6pt;z-index:251659264;visibility:visible;mso-wrap-style:square;mso-width-percent:0;mso-height-percent:0;mso-wrap-distance-left:9pt;mso-wrap-distance-top:0;mso-wrap-distance-right:9pt;mso-wrap-distance-bottom:0;mso-position-horizontal:absolute;mso-position-horizontal-relative:text;mso-position-vertical:absolute;mso-position-vertical-relative:text;mso-width-percent:0;mso-height-percent:0;mso-width-relative:margin;mso-height-relative:margin;v-text-anchor:top" coordsize="900430,1080135" o:spt="100" o:gfxdata="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" adj="-11796480,,5400" path="m,1079995r899998,l899998,,,,,1079995xe" filled="f" strokeweight=".25pt">
                 <v:stroke dashstyle="1 1" joinstyle="miter"/>
                 <v:formulas/>
                 <v:path arrowok="t" o:connecttype="custom" textboxrect="0,0,900430,1080135"/>
@@ -2235,6 +2235,7 @@
   <w:style w:type="character" w:default="1" w:styleId="Fuentedeprrafopredeter">
     <w:name w:val="Default Paragraph Font"/>
     <w:uiPriority w:val="1"/>
+    <w:semiHidden/>
     <w:unhideWhenUsed/>
   </w:style>
   <w:style w:type="table" w:default="1" w:styleId="Tablanormal">

</xml_diff>

<commit_message>
Plantillas de credenciales ajustadas
</commit_message>
<xml_diff>
--- a/public/plantillas/FrenteMatutino.docx
+++ b/public/plantillas/FrenteMatutino.docx
@@ -897,6 +897,16 @@
                               <w:r>
                                 <w:rPr>
                                   <w:rFonts w:ascii="Arial" w:hAnsi="Arial"/>
+                                  <w:b/>
+                                  <w:spacing w:val="-2"/>
+                                  <w:sz w:val="10"/>
+                                  <w:szCs w:val="10"/>
+                                </w:rPr>
+                                <w:t xml:space="preserve">   </w:t>
+                              </w:r>
+                              <w:r>
+                                <w:rPr>
+                                  <w:rFonts w:ascii="Arial" w:hAnsi="Arial"/>
                                   <w:sz w:val="10"/>
                                   <w:szCs w:val="10"/>
                                 </w:rPr>
@@ -1691,6 +1701,16 @@
                             <w:szCs w:val="10"/>
                           </w:rPr>
                           <w:t xml:space="preserve">        </w:t>
+                        </w:r>
+                        <w:r>
+                          <w:rPr>
+                            <w:rFonts w:ascii="Arial" w:hAnsi="Arial"/>
+                            <w:b/>
+                            <w:spacing w:val="-2"/>
+                            <w:sz w:val="10"/>
+                            <w:szCs w:val="10"/>
+                          </w:rPr>
+                          <w:t xml:space="preserve">   </w:t>
                         </w:r>
                         <w:r>
                           <w:rPr>
@@ -2494,7 +2514,6 @@
   <w:style w:type="character" w:default="1" w:styleId="Fuentedeprrafopredeter">
     <w:name w:val="Default Paragraph Font"/>
     <w:uiPriority w:val="1"/>
-    <w:semiHidden/>
     <w:unhideWhenUsed/>
   </w:style>
   <w:style w:type="table" w:default="1" w:styleId="Tablanormal">

</xml_diff>